<commit_message>
Leeds Bradford word version
</commit_message>
<xml_diff>
--- a/docs/quarto_docs/LeedsBradford_overview_May2025.docx
+++ b/docs/quarto_docs/LeedsBradford_overview_May2025.docx
@@ -96,7 +96,7 @@
         <w:t xml:space="preserve">Olner</w:t>
       </w:r>
     </w:p>
-    <w:bookmarkStart w:id="21" w:name="overview"/>
+    <w:bookmarkStart w:id="24" w:name="overview"/>
     <w:p>
       <w:pPr>
         <w:pStyle w:val="Heading2"/>
@@ -123,7 +123,31 @@
         <w:t xml:space="preserve">economic connection between Bradford and Leeds from 1998 to the present day</w:t>
       </w:r>
       <w:r>
-        <w:t xml:space="preserve">, putting it in a national context. It uses the latest ONS and Companies House data. The next section explores that data in detail. There are links to each chunk of analysis on the right, or scroll through them below. (Also, hover over figure citations for previews.) Open data and code for this report can be found</w:t>
+        <w:t xml:space="preserve">, putting it in a national context. It uses the latest ONS and Companies House data. The next section explores that data in detail.</w:t>
+      </w:r>
+    </w:p>
+    <w:p>
+      <w:pPr>
+        <w:pStyle w:val="BodyText"/>
+      </w:pPr>
+      <w:r>
+        <w:t xml:space="preserve">An interactive online version of this document is viewable at</w:t>
+      </w:r>
+      <w:r>
+        <w:t xml:space="preserve"> </w:t>
+      </w:r>
+      <w:r>
+        <w:rPr>
+          <w:b/>
+          <w:bCs/>
+        </w:rPr>
+        <w:t xml:space="preserve">bit.ly/lbcx2025.</w:t>
+      </w:r>
+      <w:r>
+        <w:t xml:space="preserve"> </w:t>
+      </w:r>
+      <w:r>
+        <w:t xml:space="preserve">Open data and code for this report can be found</w:t>
       </w:r>
       <w:r>
         <w:t xml:space="preserve"> </w:t>
@@ -330,7 +354,16 @@
         <w:t xml:space="preserve"> </w:t>
       </w:r>
       <w:r>
-        <w:t xml:space="preserve">(Metro Dynamics 2017).</w:t>
+        <w:t xml:space="preserve">(Metro Dynamics 2017</w:t>
+      </w:r>
+      <w:r>
+        <w:rPr>
+          <w:rStyle w:val="FootnoteReference"/>
+        </w:rPr>
+        <w:footnoteReference w:id="21"/>
+      </w:r>
+      <w:r>
+        <w:t xml:space="preserve">).</w:t>
       </w:r>
     </w:p>
     <w:p>
@@ -380,7 +413,16 @@
         <w:t xml:space="preserve"> </w:t>
       </w:r>
       <w:r>
-        <w:t xml:space="preserve">It has shaped which parts of the two cities have been able to connect the most and thus benefit from linkages. Several recent analyses (see e.g. Stansbury et al 2023) have reinforced the case that UK transport constrains core cities and their linked job markets.</w:t>
+        <w:t xml:space="preserve">It has shaped which parts of the two cities have been able to connect the most and thus benefit from linkages. Several recent analyses (see e.g. Stansbury et al 2023</w:t>
+      </w:r>
+      <w:r>
+        <w:rPr>
+          <w:rStyle w:val="FootnoteReference"/>
+        </w:rPr>
+        <w:footnoteReference w:id="22"/>
+      </w:r>
+      <w:r>
+        <w:t xml:space="preserve">) have reinforced the case that UK transport constrains core cities and their linked job markets.</w:t>
       </w:r>
     </w:p>
     <w:p>
@@ -410,7 +452,16 @@
         <w:t xml:space="preserve"> </w:t>
       </w:r>
       <w:r>
-        <w:t xml:space="preserve">(Mott McDonald p.4). This report points to the deep connections between Bradford and Leeds’ innovation and research systems, as well as their complementary service infrastructure, and the co-benefits that can underpin.</w:t>
+        <w:t xml:space="preserve">(Mott McDonald p.4</w:t>
+      </w:r>
+      <w:r>
+        <w:rPr>
+          <w:rStyle w:val="FootnoteReference"/>
+        </w:rPr>
+        <w:footnoteReference w:id="23"/>
+      </w:r>
+      <w:r>
+        <w:t xml:space="preserve">). This report points to the deep connections between Bradford and Leeds’ innovation and research systems, as well as their complementary service infrastructure, and the co-benefits that can underpin.</w:t>
       </w:r>
       <w:r>
         <w:t xml:space="preserve"> </w:t>
@@ -444,8 +495,8 @@
         <w:t xml:space="preserve">across West Yorkshire’s economy (see Companies House analysis below of growth across the region’s five local authorities).</w:t>
       </w:r>
     </w:p>
-    <w:bookmarkEnd w:id="21"/>
-    <w:bookmarkStart w:id="23" w:name="headlines-from-the-data-analysis"/>
+    <w:bookmarkEnd w:id="24"/>
+    <w:bookmarkStart w:id="26" w:name="headlines-from-the-data-analysis"/>
     <w:p>
       <w:pPr>
         <w:pStyle w:val="Heading2"/>
@@ -464,7 +515,7 @@
       <w:r>
         <w:t xml:space="preserve"> </w:t>
       </w:r>
-      <w:hyperlink r:id="rId22">
+      <w:hyperlink r:id="rId25">
         <w:r>
           <w:rPr>
             <w:rStyle w:val="Hyperlink"/>
@@ -1004,8 +1055,8 @@
         <w:t xml:space="preserve">Leeds and Bradford have separately had higher significant slopes in different sectors e.g. Bradford food/service slopes higher than 32% of other places, but Leeds much lower at 5%.</w:t>
       </w:r>
     </w:p>
-    <w:bookmarkEnd w:id="23"/>
-    <w:bookmarkStart w:id="28" w:name="X2aff8a9a73269222805d70be0b180835687ef83"/>
+    <w:bookmarkEnd w:id="26"/>
+    <w:bookmarkStart w:id="31" w:name="X2aff8a9a73269222805d70be0b180835687ef83"/>
     <w:p>
       <w:pPr>
         <w:pStyle w:val="Heading2"/>
@@ -1027,7 +1078,7 @@
       <w:tr>
         <w:tc>
           <w:tcPr/>
-          <w:bookmarkStart w:id="27" w:name="fig-sectorplot-cp-LB"/>
+          <w:bookmarkStart w:id="30" w:name="fig-sectorplot-cp-LB"/>
           <w:p>
             <w:pPr>
               <w:pStyle w:val="Compact"/>
@@ -1038,18 +1089,18 @@
                 <wp:inline>
                   <wp:extent cx="5334000" cy="5614736"/>
                   <wp:effectExtent b="0" l="0" r="0" t="0"/>
-                  <wp:docPr descr="" title="" id="25" name="Picture"/>
+                  <wp:docPr descr="" title="" id="28" name="Picture"/>
                   <a:graphic>
                     <a:graphicData uri="http://schemas.openxmlformats.org/drawingml/2006/picture">
                       <pic:pic>
                         <pic:nvPicPr>
-                          <pic:cNvPr descr="LeedsBradford_allresults_pdf_files/figure-docx/fig-sectorplot-cp-LB-1.png" id="26" name="Picture"/>
+                          <pic:cNvPr descr="LeedsBradford_allresults_pdf_files/figure-docx/fig-sectorplot-cp-LB-1.png" id="29" name="Picture"/>
                           <pic:cNvPicPr>
                             <a:picLocks noChangeArrowheads="1" noChangeAspect="1"/>
                           </pic:cNvPicPr>
                         </pic:nvPicPr>
                         <pic:blipFill>
-                          <a:blip r:embed="rId24"/>
+                          <a:blip r:embed="rId27"/>
                           <a:stretch>
                             <a:fillRect/>
                           </a:stretch>
@@ -1089,12 +1140,12 @@
               <w:t xml:space="preserve">Figure 1: Leeds / Bradford GVA per broad sector (SIC sections) as a percent of each place’s total output. 1998 to 2023, 3 year moving average.</w:t>
             </w:r>
           </w:p>
-          <w:bookmarkEnd w:id="27"/>
+          <w:bookmarkEnd w:id="30"/>
         </w:tc>
       </w:tr>
     </w:tbl>
-    <w:bookmarkEnd w:id="28"/>
-    <w:bookmarkStart w:id="33" w:name="X068f8e9b36e5a1effda2cedafbda1a2e0ea534a"/>
+    <w:bookmarkEnd w:id="31"/>
+    <w:bookmarkStart w:id="36" w:name="X068f8e9b36e5a1effda2cedafbda1a2e0ea534a"/>
     <w:p>
       <w:pPr>
         <w:pStyle w:val="Heading2"/>
@@ -1116,7 +1167,7 @@
       <w:tr>
         <w:tc>
           <w:tcPr/>
-          <w:bookmarkStart w:id="32" w:name="fig-itl3-gvaperjob"/>
+          <w:bookmarkStart w:id="35" w:name="fig-itl3-gvaperjob"/>
           <w:p>
             <w:pPr>
               <w:pStyle w:val="Compact"/>
@@ -1127,18 +1178,18 @@
                 <wp:inline>
                   <wp:extent cx="5334000" cy="5614736"/>
                   <wp:effectExtent b="0" l="0" r="0" t="0"/>
-                  <wp:docPr descr="" title="" id="30" name="Picture"/>
+                  <wp:docPr descr="" title="" id="33" name="Picture"/>
                   <a:graphic>
                     <a:graphicData uri="http://schemas.openxmlformats.org/drawingml/2006/picture">
                       <pic:pic>
                         <pic:nvPicPr>
-                          <pic:cNvPr descr="LeedsBradford_allresults_pdf_files/figure-docx/fig-itl3-gvaperjob-1.png" id="31" name="Picture"/>
+                          <pic:cNvPr descr="LeedsBradford_allresults_pdf_files/figure-docx/fig-itl3-gvaperjob-1.png" id="34" name="Picture"/>
                           <pic:cNvPicPr>
                             <a:picLocks noChangeArrowheads="1" noChangeAspect="1"/>
                           </pic:cNvPicPr>
                         </pic:nvPicPr>
                         <pic:blipFill>
-                          <a:blip r:embed="rId29"/>
+                          <a:blip r:embed="rId32"/>
                           <a:stretch>
                             <a:fillRect/>
                           </a:stretch>
@@ -1178,12 +1229,12 @@
               <w:t xml:space="preserve">Figure 2: Inflation-adjusted GVA per job / per broad sector for Leeds (blue) and Bradford (red) compared to the rest of the UK (grey), ordered by average productivity per sector. Broken into higher and lower GVA per job, top and bottom.</w:t>
             </w:r>
           </w:p>
-          <w:bookmarkEnd w:id="32"/>
+          <w:bookmarkEnd w:id="35"/>
         </w:tc>
       </w:tr>
     </w:tbl>
-    <w:bookmarkEnd w:id="33"/>
-    <w:bookmarkStart w:id="38" w:name="Xf99a2c93c9dc7950b721a32bacdf9ae5c266d4c"/>
+    <w:bookmarkEnd w:id="36"/>
+    <w:bookmarkStart w:id="41" w:name="Xf99a2c93c9dc7950b721a32bacdf9ae5c266d4c"/>
     <w:p>
       <w:pPr>
         <w:pStyle w:val="Heading2"/>
@@ -1223,7 +1274,7 @@
       <w:tr>
         <w:tc>
           <w:tcPr/>
-          <w:bookmarkStart w:id="37" w:name="fig-percentempfourplaces"/>
+          <w:bookmarkStart w:id="40" w:name="fig-percentempfourplaces"/>
           <w:p>
             <w:pPr>
               <w:pStyle w:val="Compact"/>
@@ -1234,18 +1285,18 @@
                 <wp:inline>
                   <wp:extent cx="5334000" cy="4491789"/>
                   <wp:effectExtent b="0" l="0" r="0" t="0"/>
-                  <wp:docPr descr="" title="" id="35" name="Picture"/>
+                  <wp:docPr descr="" title="" id="38" name="Picture"/>
                   <a:graphic>
                     <a:graphicData uri="http://schemas.openxmlformats.org/drawingml/2006/picture">
                       <pic:pic>
                         <pic:nvPicPr>
-                          <pic:cNvPr descr="LeedsBradford_allresults_pdf_files/figure-docx/fig-percentempfourplaces-1.png" id="36" name="Picture"/>
+                          <pic:cNvPr descr="LeedsBradford_allresults_pdf_files/figure-docx/fig-percentempfourplaces-1.png" id="39" name="Picture"/>
                           <pic:cNvPicPr>
                             <a:picLocks noChangeArrowheads="1" noChangeAspect="1"/>
                           </pic:cNvPicPr>
                         </pic:nvPicPr>
                         <pic:blipFill>
-                          <a:blip r:embed="rId34"/>
+                          <a:blip r:embed="rId37"/>
                           <a:stretch>
                             <a:fillRect/>
                           </a:stretch>
@@ -1285,12 +1336,12 @@
               <w:t xml:space="preserve">Figure 3: Companies House firm level data: percent change in employment for firms with ten+ employees between most recent accounts and previous year - core cities, with West Yorkshire’s five local authorities overlaid. Hover for place name.</w:t>
             </w:r>
           </w:p>
-          <w:bookmarkEnd w:id="37"/>
+          <w:bookmarkEnd w:id="40"/>
         </w:tc>
       </w:tr>
     </w:tbl>
-    <w:bookmarkEnd w:id="38"/>
-    <w:bookmarkStart w:id="43" w:name="X15dbf41c936055a6390a02262926ac435e82f22"/>
+    <w:bookmarkEnd w:id="41"/>
+    <w:bookmarkStart w:id="46" w:name="X15dbf41c936055a6390a02262926ac435e82f22"/>
     <w:p>
       <w:pPr>
         <w:pStyle w:val="Heading2"/>
@@ -1312,7 +1363,7 @@
       <w:tr>
         <w:tc>
           <w:tcPr/>
-          <w:bookmarkStart w:id="42" w:name="fig-percentempfourplaces_lessthan10"/>
+          <w:bookmarkStart w:id="45" w:name="fig-percentempfourplaces_lessthan10"/>
           <w:p>
             <w:pPr>
               <w:pStyle w:val="Compact"/>
@@ -1323,18 +1374,18 @@
                 <wp:inline>
                   <wp:extent cx="5334000" cy="4491789"/>
                   <wp:effectExtent b="0" l="0" r="0" t="0"/>
-                  <wp:docPr descr="" title="" id="40" name="Picture"/>
+                  <wp:docPr descr="" title="" id="43" name="Picture"/>
                   <a:graphic>
                     <a:graphicData uri="http://schemas.openxmlformats.org/drawingml/2006/picture">
                       <pic:pic>
                         <pic:nvPicPr>
-                          <pic:cNvPr descr="LeedsBradford_allresults_pdf_files/figure-docx/fig-percentempfourplaces_lessthan10-1.png" id="41" name="Picture"/>
+                          <pic:cNvPr descr="LeedsBradford_allresults_pdf_files/figure-docx/fig-percentempfourplaces_lessthan10-1.png" id="44" name="Picture"/>
                           <pic:cNvPicPr>
                             <a:picLocks noChangeArrowheads="1" noChangeAspect="1"/>
                           </pic:cNvPicPr>
                         </pic:nvPicPr>
                         <pic:blipFill>
-                          <a:blip r:embed="rId39"/>
+                          <a:blip r:embed="rId42"/>
                           <a:stretch>
                             <a:fillRect/>
                           </a:stretch>
@@ -1374,12 +1425,12 @@
               <w:t xml:space="preserve">Figure 4: From Companies House firm level data: percent change in employment for firms with fewer than 10 employees, between most recent accounts and previous year - core cities, with West Yorkshire’s five local authorities overlaid. Hover for place name.</w:t>
             </w:r>
           </w:p>
-          <w:bookmarkEnd w:id="42"/>
+          <w:bookmarkEnd w:id="45"/>
         </w:tc>
       </w:tr>
     </w:tbl>
-    <w:bookmarkEnd w:id="43"/>
-    <w:bookmarkStart w:id="49" w:name="X7ebca0b4bf527a70f671ced97fd3c9e0e055690"/>
+    <w:bookmarkEnd w:id="46"/>
+    <w:bookmarkStart w:id="52" w:name="X7ebca0b4bf527a70f671ced97fd3c9e0e055690"/>
     <w:p>
       <w:pPr>
         <w:pStyle w:val="Heading2"/>
@@ -1406,7 +1457,7 @@
         </w:rPr>
         <w:t xml:space="preserve"> </w:t>
       </w:r>
-      <w:hyperlink r:id="rId44">
+      <w:hyperlink r:id="rId47">
         <w:r>
           <w:rPr>
             <w:rStyle w:val="Hyperlink"/>
@@ -1516,7 +1567,7 @@
       <w:tr>
         <w:tc>
           <w:tcPr/>
-          <w:bookmarkStart w:id="48" w:name="fig-LQslopes"/>
+          <w:bookmarkStart w:id="51" w:name="fig-LQslopes"/>
           <w:p>
             <w:pPr>
               <w:pStyle w:val="Compact"/>
@@ -1527,18 +1578,18 @@
                 <wp:inline>
                   <wp:extent cx="5334000" cy="5614736"/>
                   <wp:effectExtent b="0" l="0" r="0" t="0"/>
-                  <wp:docPr descr="" title="" id="46" name="Picture"/>
+                  <wp:docPr descr="" title="" id="49" name="Picture"/>
                   <a:graphic>
                     <a:graphicData uri="http://schemas.openxmlformats.org/drawingml/2006/picture">
                       <pic:pic>
                         <pic:nvPicPr>
-                          <pic:cNvPr descr="LeedsBradford_allresults_pdf_files/figure-docx/fig-LQslopes-1.png" id="47" name="Picture"/>
+                          <pic:cNvPr descr="LeedsBradford_allresults_pdf_files/figure-docx/fig-LQslopes-1.png" id="50" name="Picture"/>
                           <pic:cNvPicPr>
                             <a:picLocks noChangeArrowheads="1" noChangeAspect="1"/>
                           </pic:cNvPicPr>
                         </pic:nvPicPr>
                         <pic:blipFill>
-                          <a:blip r:embed="rId45"/>
+                          <a:blip r:embed="rId48"/>
                           <a:stretch>
                             <a:fillRect/>
                           </a:stretch>
@@ -1578,12 +1629,12 @@
               <w:t xml:space="preserve">Figure 5: Location quotient change for Leeds and Bradford’s broad sectors - see below for full plot details.</w:t>
             </w:r>
           </w:p>
-          <w:bookmarkEnd w:id="48"/>
+          <w:bookmarkEnd w:id="51"/>
         </w:tc>
       </w:tr>
     </w:tbl>
-    <w:bookmarkEnd w:id="49"/>
-    <w:bookmarkStart w:id="54" w:name="X8ba3c45d90df8798b990e3ef93ba8b08b43f651"/>
+    <w:bookmarkEnd w:id="52"/>
+    <w:bookmarkStart w:id="57" w:name="X8ba3c45d90df8798b990e3ef93ba8b08b43f651"/>
     <w:p>
       <w:pPr>
         <w:pStyle w:val="Heading2"/>
@@ -1621,7 +1672,7 @@
       <w:tr>
         <w:tc>
           <w:tcPr/>
-          <w:bookmarkStart w:id="53" w:name="fig-props"/>
+          <w:bookmarkStart w:id="56" w:name="fig-props"/>
           <w:p>
             <w:pPr>
               <w:pStyle w:val="Compact"/>
@@ -1632,18 +1683,18 @@
                 <wp:inline>
                   <wp:extent cx="5334000" cy="4491789"/>
                   <wp:effectExtent b="0" l="0" r="0" t="0"/>
-                  <wp:docPr descr="" title="" id="51" name="Picture"/>
+                  <wp:docPr descr="" title="" id="54" name="Picture"/>
                   <a:graphic>
                     <a:graphicData uri="http://schemas.openxmlformats.org/drawingml/2006/picture">
                       <pic:pic>
                         <pic:nvPicPr>
-                          <pic:cNvPr descr="LeedsBradford_allresults_pdf_files/figure-docx/fig-props-1.png" id="52" name="Picture"/>
+                          <pic:cNvPr descr="LeedsBradford_allresults_pdf_files/figure-docx/fig-props-1.png" id="55" name="Picture"/>
                           <pic:cNvPicPr>
                             <a:picLocks noChangeArrowheads="1" noChangeAspect="1"/>
                           </pic:cNvPicPr>
                         </pic:nvPicPr>
                         <pic:blipFill>
-                          <a:blip r:embed="rId50"/>
+                          <a:blip r:embed="rId53"/>
                           <a:stretch>
                             <a:fillRect/>
                           </a:stretch>
@@ -1683,12 +1734,12 @@
               <w:t xml:space="preserve">Figure 6: Change between 1998 and 2023 (5 yr moving av) in Leeds and Bradford sectors (2 digit SIC). Leeds on x axis, Bradford on y axis, arrow points between 1998-2022 average and most recent 5 year average.</w:t>
             </w:r>
           </w:p>
-          <w:bookmarkEnd w:id="53"/>
+          <w:bookmarkEnd w:id="56"/>
         </w:tc>
       </w:tr>
     </w:tbl>
-    <w:bookmarkEnd w:id="54"/>
-    <w:bookmarkStart w:id="59" w:name="X0690118513864e817fb1ade8a36bf7fceedf9df"/>
+    <w:bookmarkEnd w:id="57"/>
+    <w:bookmarkStart w:id="62" w:name="X0690118513864e817fb1ade8a36bf7fceedf9df"/>
     <w:p>
       <w:pPr>
         <w:pStyle w:val="Heading2"/>
@@ -1815,7 +1866,7 @@
       <w:tr>
         <w:tc>
           <w:tcPr/>
-          <w:bookmarkStart w:id="58" w:name="fig-plotslopecounts"/>
+          <w:bookmarkStart w:id="61" w:name="fig-plotslopecounts"/>
           <w:p>
             <w:pPr>
               <w:pStyle w:val="Compact"/>
@@ -1826,18 +1877,18 @@
                 <wp:inline>
                   <wp:extent cx="5334000" cy="4491789"/>
                   <wp:effectExtent b="0" l="0" r="0" t="0"/>
-                  <wp:docPr descr="" title="" id="56" name="Picture"/>
+                  <wp:docPr descr="" title="" id="59" name="Picture"/>
                   <a:graphic>
                     <a:graphicData uri="http://schemas.openxmlformats.org/drawingml/2006/picture">
                       <pic:pic>
                         <pic:nvPicPr>
-                          <pic:cNvPr descr="LeedsBradford_allresults_pdf_files/figure-docx/fig-plotslopecounts-1.png" id="57" name="Picture"/>
+                          <pic:cNvPr descr="LeedsBradford_allresults_pdf_files/figure-docx/fig-plotslopecounts-1.png" id="60" name="Picture"/>
                           <pic:cNvPicPr>
                             <a:picLocks noChangeArrowheads="1" noChangeAspect="1"/>
                           </pic:cNvPicPr>
                         </pic:nvPicPr>
                         <pic:blipFill>
-                          <a:blip r:embed="rId55"/>
+                          <a:blip r:embed="rId58"/>
                           <a:stretch>
                             <a:fillRect/>
                           </a:stretch>
@@ -1877,11 +1928,11 @@
               <w:t xml:space="preserve">Figure 7: Percent of pair comparisons where Leeds (x axis) or Bradford (y axis) sectors have grown significantly more than other ITL3 zones (95% CIs don’t overlap) in the last decade.</w:t>
             </w:r>
           </w:p>
-          <w:bookmarkEnd w:id="58"/>
+          <w:bookmarkEnd w:id="61"/>
         </w:tc>
       </w:tr>
     </w:tbl>
-    <w:bookmarkEnd w:id="59"/>
+    <w:bookmarkEnd w:id="62"/>
     <w:sectPr/>
   </w:body>
 </w:document>
@@ -1904,6 +1955,87 @@
     <w:p>
       <w:r>
         <w:separator/>
+      </w:r>
+    </w:p>
+  </w:footnote>
+  <w:footnote w:id="21">
+    <w:p>
+      <w:pPr>
+        <w:pStyle w:val="FootnoteText"/>
+      </w:pPr>
+      <w:r>
+        <w:rPr>
+          <w:rStyle w:val="FootnoteReference"/>
+        </w:rPr>
+        <w:footnoteRef/>
+      </w:r>
+      <w:r>
+        <w:t xml:space="preserve"> </w:t>
+      </w:r>
+      <w:r>
+        <w:t xml:space="preserve">“</w:t>
+      </w:r>
+      <w:r>
+        <w:t xml:space="preserve">Bradford Economic Intelligence</w:t>
+      </w:r>
+      <w:r>
+        <w:t xml:space="preserve">”</w:t>
+      </w:r>
+      <w:r>
+        <w:t xml:space="preserve"> </w:t>
+      </w:r>
+      <w:r>
+        <w:t xml:space="preserve">report, Metro dynamics. July 2017</w:t>
+      </w:r>
+    </w:p>
+  </w:footnote>
+  <w:footnote w:id="22">
+    <w:p>
+      <w:pPr>
+        <w:pStyle w:val="FootnoteText"/>
+      </w:pPr>
+      <w:r>
+        <w:rPr>
+          <w:rStyle w:val="FootnoteReference"/>
+        </w:rPr>
+        <w:footnoteRef/>
+      </w:r>
+      <w:r>
+        <w:t xml:space="preserve"> </w:t>
+      </w:r>
+      <w:r>
+        <w:t xml:space="preserve">Stansbury, A., Turner ,Dan, and Balls, E., 2023. Tackling the UK’s regional economic inequality: binding constraints and avenues for policy intervention. Contemporary Social Science 18, 318–356.</w:t>
+      </w:r>
+    </w:p>
+  </w:footnote>
+  <w:footnote w:id="23">
+    <w:p>
+      <w:pPr>
+        <w:pStyle w:val="FootnoteText"/>
+      </w:pPr>
+      <w:r>
+        <w:rPr>
+          <w:rStyle w:val="FootnoteReference"/>
+        </w:rPr>
+        <w:footnoteRef/>
+      </w:r>
+      <w:r>
+        <w:t xml:space="preserve"> </w:t>
+      </w:r>
+      <w:r>
+        <w:t xml:space="preserve">“</w:t>
+      </w:r>
+      <w:r>
+        <w:t xml:space="preserve">How to kickstart a northern renaissance: A vision-led case for investing n Northern Powerhouse Rail</w:t>
+      </w:r>
+      <w:r>
+        <w:t xml:space="preserve">”</w:t>
+      </w:r>
+      <w:r>
+        <w:t xml:space="preserve"> </w:t>
+      </w:r>
+      <w:r>
+        <w:t xml:space="preserve">report, Mott McDonald. 2021.</w:t>
       </w:r>
     </w:p>
   </w:footnote>

</xml_diff>